<commit_message>
feat(nomenclature) : generate files with new values (CISU v2.3)
</commit_message>
<xml_diff>
--- a/nomenclature_parser/out/latest/Sommaire Nomenclature Hub.docx
+++ b/nomenclature_parser/out/latest/Sommaire Nomenclature Hub.docx
@@ -61,762 +61,6 @@
           <w:p>
             <w:r>
               <w:t>Référentiel d'origine de la norme</w:t>
-            </w:r>
-          </w:p>
-        </w:tc>
-      </w:tr>
-      <w:tr>
-        <w:tc>
-          <w:tcPr>
-            <w:tcW w:type="dxa" w:w="2160"/>
-          </w:tcPr>
-          <w:p>
-            <w:r>
-              <w:t>EMSI-RESOURCE.RTYPE.CAPABILITY</w:t>
-            </w:r>
-          </w:p>
-        </w:tc>
-        <w:tc>
-          <w:tcPr>
-            <w:tcW w:type="dxa" w:w="2160"/>
-          </w:tcPr>
-          <w:p>
-            <w:r>
-              <w:t>RESOURCE.RTYPE.CAPABILITY</w:t>
-            </w:r>
-          </w:p>
-        </w:tc>
-        <w:tc>
-          <w:tcPr>
-            <w:tcW w:type="dxa" w:w="2160"/>
-          </w:tcPr>
-          <w:p>
-            <w:r>
-              <w:t>EMSI-RESOURCE.RTYPE.CAPABILITY</w:t>
-            </w:r>
-          </w:p>
-        </w:tc>
-        <w:tc>
-          <w:tcPr>
-            <w:tcW w:type="dxa" w:w="2160"/>
-          </w:tcPr>
-          <w:p>
-            <w:r>
-              <w:t>EMSI</w:t>
-            </w:r>
-          </w:p>
-        </w:tc>
-      </w:tr>
-      <w:tr>
-        <w:tc>
-          <w:tcPr>
-            <w:tcW w:type="dxa" w:w="2160"/>
-          </w:tcPr>
-          <w:p>
-            <w:r>
-              <w:t>EMSI-RESOURCE.RTYPE.CLASS</w:t>
-            </w:r>
-          </w:p>
-        </w:tc>
-        <w:tc>
-          <w:tcPr>
-            <w:tcW w:type="dxa" w:w="2160"/>
-          </w:tcPr>
-          <w:p>
-            <w:r>
-              <w:t>RESOURCE.RTYPE.CLASS</w:t>
-            </w:r>
-          </w:p>
-        </w:tc>
-        <w:tc>
-          <w:tcPr>
-            <w:tcW w:type="dxa" w:w="2160"/>
-          </w:tcPr>
-          <w:p>
-            <w:r>
-              <w:t>EMSI-RESOURCE.RTYPE.CLASS</w:t>
-            </w:r>
-          </w:p>
-        </w:tc>
-        <w:tc>
-          <w:tcPr>
-            <w:tcW w:type="dxa" w:w="2160"/>
-          </w:tcPr>
-          <w:p>
-            <w:r>
-              <w:t>EMSI</w:t>
-            </w:r>
-          </w:p>
-        </w:tc>
-      </w:tr>
-      <w:tr>
-        <w:tc>
-          <w:tcPr>
-            <w:tcW w:type="dxa" w:w="2160"/>
-          </w:tcPr>
-          <w:p>
-            <w:r>
-              <w:t>EMSI-RESOURCE.UM</w:t>
-            </w:r>
-          </w:p>
-        </w:tc>
-        <w:tc>
-          <w:tcPr>
-            <w:tcW w:type="dxa" w:w="2160"/>
-          </w:tcPr>
-          <w:p>
-            <w:r>
-              <w:t>RESOURCE.UM</w:t>
-            </w:r>
-          </w:p>
-        </w:tc>
-        <w:tc>
-          <w:tcPr>
-            <w:tcW w:type="dxa" w:w="2160"/>
-          </w:tcPr>
-          <w:p>
-            <w:r>
-              <w:t>EMSI-RESOURCE.UM</w:t>
-            </w:r>
-          </w:p>
-        </w:tc>
-        <w:tc>
-          <w:tcPr>
-            <w:tcW w:type="dxa" w:w="2160"/>
-          </w:tcPr>
-          <w:p>
-            <w:r>
-              <w:t>EMSI</w:t>
-            </w:r>
-          </w:p>
-        </w:tc>
-      </w:tr>
-      <w:tr>
-        <w:tc>
-          <w:tcPr>
-            <w:tcW w:type="dxa" w:w="2160"/>
-          </w:tcPr>
-          <w:p>
-            <w:r>
-              <w:t>EMSI-RGEO.POSITION.TYPE</w:t>
-            </w:r>
-          </w:p>
-        </w:tc>
-        <w:tc>
-          <w:tcPr>
-            <w:tcW w:type="dxa" w:w="2160"/>
-          </w:tcPr>
-          <w:p>
-            <w:r>
-              <w:t>RGEO.POSITION.TYPE</w:t>
-            </w:r>
-          </w:p>
-        </w:tc>
-        <w:tc>
-          <w:tcPr>
-            <w:tcW w:type="dxa" w:w="2160"/>
-          </w:tcPr>
-          <w:p>
-            <w:r>
-              <w:t>EMSI-RGEO.POSITION.TYPE</w:t>
-            </w:r>
-          </w:p>
-        </w:tc>
-        <w:tc>
-          <w:tcPr>
-            <w:tcW w:type="dxa" w:w="2160"/>
-          </w:tcPr>
-          <w:p>
-            <w:r>
-              <w:t>EMSI</w:t>
-            </w:r>
-          </w:p>
-        </w:tc>
-      </w:tr>
-      <w:tr>
-        <w:tc>
-          <w:tcPr>
-            <w:tcW w:type="dxa" w:w="2160"/>
-          </w:tcPr>
-          <w:p>
-            <w:r>
-              <w:t>EMSI-MISSION.TYPE</w:t>
-            </w:r>
-          </w:p>
-        </w:tc>
-        <w:tc>
-          <w:tcPr>
-            <w:tcW w:type="dxa" w:w="2160"/>
-          </w:tcPr>
-          <w:p>
-            <w:r>
-              <w:t>MISSION.TYPE</w:t>
-            </w:r>
-          </w:p>
-        </w:tc>
-        <w:tc>
-          <w:tcPr>
-            <w:tcW w:type="dxa" w:w="2160"/>
-          </w:tcPr>
-          <w:p>
-            <w:r>
-              <w:t>EMSI-MISSION.TYPE</w:t>
-            </w:r>
-          </w:p>
-        </w:tc>
-        <w:tc>
-          <w:tcPr>
-            <w:tcW w:type="dxa" w:w="2160"/>
-          </w:tcPr>
-          <w:p>
-            <w:r>
-              <w:t>EMSI</w:t>
-            </w:r>
-          </w:p>
-        </w:tc>
-      </w:tr>
-      <w:tr>
-        <w:tc>
-          <w:tcPr>
-            <w:tcW w:type="dxa" w:w="2160"/>
-          </w:tcPr>
-          <w:p>
-            <w:r>
-              <w:t>EMSI-EVENT.CAUSE</w:t>
-            </w:r>
-          </w:p>
-        </w:tc>
-        <w:tc>
-          <w:tcPr>
-            <w:tcW w:type="dxa" w:w="2160"/>
-          </w:tcPr>
-          <w:p>
-            <w:r>
-              <w:t>EVENT.CAUSE</w:t>
-            </w:r>
-          </w:p>
-        </w:tc>
-        <w:tc>
-          <w:tcPr>
-            <w:tcW w:type="dxa" w:w="2160"/>
-          </w:tcPr>
-          <w:p>
-            <w:r>
-              <w:t>EMSI-EVENT.CAUSE</w:t>
-            </w:r>
-          </w:p>
-        </w:tc>
-        <w:tc>
-          <w:tcPr>
-            <w:tcW w:type="dxa" w:w="2160"/>
-          </w:tcPr>
-          <w:p>
-            <w:r>
-              <w:t>EMSI</w:t>
-            </w:r>
-          </w:p>
-        </w:tc>
-      </w:tr>
-      <w:tr>
-        <w:tc>
-          <w:tcPr>
-            <w:tcW w:type="dxa" w:w="2160"/>
-          </w:tcPr>
-          <w:p>
-            <w:r>
-              <w:t>EMSI-EVENT.POSITION.TYPE</w:t>
-            </w:r>
-          </w:p>
-        </w:tc>
-        <w:tc>
-          <w:tcPr>
-            <w:tcW w:type="dxa" w:w="2160"/>
-          </w:tcPr>
-          <w:p>
-            <w:r>
-              <w:t>EVENT.POSITION.TYPE</w:t>
-            </w:r>
-          </w:p>
-        </w:tc>
-        <w:tc>
-          <w:tcPr>
-            <w:tcW w:type="dxa" w:w="2160"/>
-          </w:tcPr>
-          <w:p>
-            <w:r>
-              <w:t>EMSI-EVENT.POSITION.TYPE</w:t>
-            </w:r>
-          </w:p>
-        </w:tc>
-        <w:tc>
-          <w:tcPr>
-            <w:tcW w:type="dxa" w:w="2160"/>
-          </w:tcPr>
-          <w:p>
-            <w:r>
-              <w:t>EMSI</w:t>
-            </w:r>
-          </w:p>
-        </w:tc>
-      </w:tr>
-      <w:tr>
-        <w:tc>
-          <w:tcPr>
-            <w:tcW w:type="dxa" w:w="2160"/>
-          </w:tcPr>
-          <w:p>
-            <w:r>
-              <w:t>EMSI-EVENT.EGEO.WEATHER</w:t>
-            </w:r>
-          </w:p>
-        </w:tc>
-        <w:tc>
-          <w:tcPr>
-            <w:tcW w:type="dxa" w:w="2160"/>
-          </w:tcPr>
-          <w:p>
-            <w:r>
-              <w:t>EVENT.EGEO.WEATHER</w:t>
-            </w:r>
-          </w:p>
-        </w:tc>
-        <w:tc>
-          <w:tcPr>
-            <w:tcW w:type="dxa" w:w="2160"/>
-          </w:tcPr>
-          <w:p>
-            <w:r>
-              <w:t>EMSI-EVENT.EGEO.WEATHER</w:t>
-            </w:r>
-          </w:p>
-        </w:tc>
-        <w:tc>
-          <w:tcPr>
-            <w:tcW w:type="dxa" w:w="2160"/>
-          </w:tcPr>
-          <w:p>
-            <w:r>
-              <w:t>EMSI</w:t>
-            </w:r>
-          </w:p>
-        </w:tc>
-      </w:tr>
-      <w:tr>
-        <w:tc>
-          <w:tcPr>
-            <w:tcW w:type="dxa" w:w="2160"/>
-          </w:tcPr>
-          <w:p>
-            <w:r>
-              <w:t>EMSI-EVENT.EGEO.TYPE</w:t>
-            </w:r>
-          </w:p>
-        </w:tc>
-        <w:tc>
-          <w:tcPr>
-            <w:tcW w:type="dxa" w:w="2160"/>
-          </w:tcPr>
-          <w:p>
-            <w:r>
-              <w:t>EVENT.EGEO.TYPE</w:t>
-            </w:r>
-          </w:p>
-        </w:tc>
-        <w:tc>
-          <w:tcPr>
-            <w:tcW w:type="dxa" w:w="2160"/>
-          </w:tcPr>
-          <w:p>
-            <w:r>
-              <w:t>EMSI-EVENT.EGEO.TYPE</w:t>
-            </w:r>
-          </w:p>
-        </w:tc>
-        <w:tc>
-          <w:tcPr>
-            <w:tcW w:type="dxa" w:w="2160"/>
-          </w:tcPr>
-          <w:p>
-            <w:r>
-              <w:t>EMSI</w:t>
-            </w:r>
-          </w:p>
-        </w:tc>
-      </w:tr>
-      <w:tr>
-        <w:tc>
-          <w:tcPr>
-            <w:tcW w:type="dxa" w:w="2160"/>
-          </w:tcPr>
-          <w:p>
-            <w:r>
-              <w:t>EMSI-EVENT.RISK_ASSESSMNT</w:t>
-            </w:r>
-          </w:p>
-        </w:tc>
-        <w:tc>
-          <w:tcPr>
-            <w:tcW w:type="dxa" w:w="2160"/>
-          </w:tcPr>
-          <w:p>
-            <w:r>
-              <w:t>EVENT.RISK_ASSESSMNT</w:t>
-            </w:r>
-          </w:p>
-        </w:tc>
-        <w:tc>
-          <w:tcPr>
-            <w:tcW w:type="dxa" w:w="2160"/>
-          </w:tcPr>
-          <w:p>
-            <w:r>
-              <w:t>EMSI-EVENT.RISK_ASSESSMNT</w:t>
-            </w:r>
-          </w:p>
-        </w:tc>
-        <w:tc>
-          <w:tcPr>
-            <w:tcW w:type="dxa" w:w="2160"/>
-          </w:tcPr>
-          <w:p>
-            <w:r>
-              <w:t>EMSI</w:t>
-            </w:r>
-          </w:p>
-        </w:tc>
-      </w:tr>
-      <w:tr>
-        <w:tc>
-          <w:tcPr>
-            <w:tcW w:type="dxa" w:w="2160"/>
-          </w:tcPr>
-          <w:p>
-            <w:r>
-              <w:t>EMSI-EVENT.STATUS</w:t>
-            </w:r>
-          </w:p>
-        </w:tc>
-        <w:tc>
-          <w:tcPr>
-            <w:tcW w:type="dxa" w:w="2160"/>
-          </w:tcPr>
-          <w:p>
-            <w:r>
-              <w:t>EVENT.STATUS</w:t>
-            </w:r>
-          </w:p>
-        </w:tc>
-        <w:tc>
-          <w:tcPr>
-            <w:tcW w:type="dxa" w:w="2160"/>
-          </w:tcPr>
-          <w:p>
-            <w:r>
-              <w:t>EMSI-EVENT.STATUS</w:t>
-            </w:r>
-          </w:p>
-        </w:tc>
-        <w:tc>
-          <w:tcPr>
-            <w:tcW w:type="dxa" w:w="2160"/>
-          </w:tcPr>
-          <w:p>
-            <w:r>
-              <w:t>EMSI</w:t>
-            </w:r>
-          </w:p>
-        </w:tc>
-      </w:tr>
-      <w:tr>
-        <w:tc>
-          <w:tcPr>
-            <w:tcW w:type="dxa" w:w="2160"/>
-          </w:tcPr>
-          <w:p>
-            <w:r>
-              <w:t>EMSI-EVENT.SCALE</w:t>
-            </w:r>
-          </w:p>
-        </w:tc>
-        <w:tc>
-          <w:tcPr>
-            <w:tcW w:type="dxa" w:w="2160"/>
-          </w:tcPr>
-          <w:p>
-            <w:r>
-              <w:t>EVENT.SCALE</w:t>
-            </w:r>
-          </w:p>
-        </w:tc>
-        <w:tc>
-          <w:tcPr>
-            <w:tcW w:type="dxa" w:w="2160"/>
-          </w:tcPr>
-          <w:p>
-            <w:r>
-              <w:t>EMSI-EVENT.SCALE</w:t>
-            </w:r>
-          </w:p>
-        </w:tc>
-        <w:tc>
-          <w:tcPr>
-            <w:tcW w:type="dxa" w:w="2160"/>
-          </w:tcPr>
-          <w:p>
-            <w:r>
-              <w:t>EMSI</w:t>
-            </w:r>
-          </w:p>
-        </w:tc>
-      </w:tr>
-      <w:tr>
-        <w:tc>
-          <w:tcPr>
-            <w:tcW w:type="dxa" w:w="2160"/>
-          </w:tcPr>
-          <w:p>
-            <w:r>
-              <w:t>EMSI-EVENT.SOURCE</w:t>
-            </w:r>
-          </w:p>
-        </w:tc>
-        <w:tc>
-          <w:tcPr>
-            <w:tcW w:type="dxa" w:w="2160"/>
-          </w:tcPr>
-          <w:p>
-            <w:r>
-              <w:t>EVENT.SOURCE</w:t>
-            </w:r>
-          </w:p>
-        </w:tc>
-        <w:tc>
-          <w:tcPr>
-            <w:tcW w:type="dxa" w:w="2160"/>
-          </w:tcPr>
-          <w:p>
-            <w:r>
-              <w:t>EMSI-EVENT.SOURCE</w:t>
-            </w:r>
-          </w:p>
-        </w:tc>
-        <w:tc>
-          <w:tcPr>
-            <w:tcW w:type="dxa" w:w="2160"/>
-          </w:tcPr>
-          <w:p>
-            <w:r>
-              <w:t>EMSI</w:t>
-            </w:r>
-          </w:p>
-        </w:tc>
-      </w:tr>
-      <w:tr>
-        <w:tc>
-          <w:tcPr>
-            <w:tcW w:type="dxa" w:w="2160"/>
-          </w:tcPr>
-          <w:p>
-            <w:r>
-              <w:t>EMSI-EVENT.ETYPE.ENV</w:t>
-            </w:r>
-          </w:p>
-        </w:tc>
-        <w:tc>
-          <w:tcPr>
-            <w:tcW w:type="dxa" w:w="2160"/>
-          </w:tcPr>
-          <w:p>
-            <w:r>
-              <w:t>EVENT.ETYPE.ENV</w:t>
-            </w:r>
-          </w:p>
-        </w:tc>
-        <w:tc>
-          <w:tcPr>
-            <w:tcW w:type="dxa" w:w="2160"/>
-          </w:tcPr>
-          <w:p>
-            <w:r>
-              <w:t>EMSI-EVENT.ETYPE.ENV</w:t>
-            </w:r>
-          </w:p>
-        </w:tc>
-        <w:tc>
-          <w:tcPr>
-            <w:tcW w:type="dxa" w:w="2160"/>
-          </w:tcPr>
-          <w:p>
-            <w:r>
-              <w:t>EMSI</w:t>
-            </w:r>
-          </w:p>
-        </w:tc>
-      </w:tr>
-      <w:tr>
-        <w:tc>
-          <w:tcPr>
-            <w:tcW w:type="dxa" w:w="2160"/>
-          </w:tcPr>
-          <w:p>
-            <w:r>
-              <w:t>EMSI-EVENT.ETYPE.LOCTYPE</w:t>
-            </w:r>
-          </w:p>
-        </w:tc>
-        <w:tc>
-          <w:tcPr>
-            <w:tcW w:type="dxa" w:w="2160"/>
-          </w:tcPr>
-          <w:p>
-            <w:r>
-              <w:t>EVENT.ETYPE.LOCTYPE</w:t>
-            </w:r>
-          </w:p>
-        </w:tc>
-        <w:tc>
-          <w:tcPr>
-            <w:tcW w:type="dxa" w:w="2160"/>
-          </w:tcPr>
-          <w:p>
-            <w:r>
-              <w:t>EMSI-EVENT.ETYPE.LOCTYPE</w:t>
-            </w:r>
-          </w:p>
-        </w:tc>
-        <w:tc>
-          <w:tcPr>
-            <w:tcW w:type="dxa" w:w="2160"/>
-          </w:tcPr>
-          <w:p>
-            <w:r>
-              <w:t>EMSI</w:t>
-            </w:r>
-          </w:p>
-        </w:tc>
-      </w:tr>
-      <w:tr>
-        <w:tc>
-          <w:tcPr>
-            <w:tcW w:type="dxa" w:w="2160"/>
-          </w:tcPr>
-          <w:p>
-            <w:r>
-              <w:t>EMSI-EVENT.ETYPE.ACTOR</w:t>
-            </w:r>
-          </w:p>
-        </w:tc>
-        <w:tc>
-          <w:tcPr>
-            <w:tcW w:type="dxa" w:w="2160"/>
-          </w:tcPr>
-          <w:p>
-            <w:r>
-              <w:t>EVENT.ETYPE.ACTOR</w:t>
-            </w:r>
-          </w:p>
-        </w:tc>
-        <w:tc>
-          <w:tcPr>
-            <w:tcW w:type="dxa" w:w="2160"/>
-          </w:tcPr>
-          <w:p>
-            <w:r>
-              <w:t>EMSI-EVENT.ETYPE.ACTOR</w:t>
-            </w:r>
-          </w:p>
-        </w:tc>
-        <w:tc>
-          <w:tcPr>
-            <w:tcW w:type="dxa" w:w="2160"/>
-          </w:tcPr>
-          <w:p>
-            <w:r>
-              <w:t>EMSI</w:t>
-            </w:r>
-          </w:p>
-        </w:tc>
-      </w:tr>
-      <w:tr>
-        <w:tc>
-          <w:tcPr>
-            <w:tcW w:type="dxa" w:w="2160"/>
-          </w:tcPr>
-          <w:p>
-            <w:r>
-              <w:t>EMSI-EVENT.ETYPE.CATEGORY</w:t>
-            </w:r>
-          </w:p>
-        </w:tc>
-        <w:tc>
-          <w:tcPr>
-            <w:tcW w:type="dxa" w:w="2160"/>
-          </w:tcPr>
-          <w:p>
-            <w:r>
-              <w:t>EVENT.ETYPE.CATEGORY</w:t>
-            </w:r>
-          </w:p>
-        </w:tc>
-        <w:tc>
-          <w:tcPr>
-            <w:tcW w:type="dxa" w:w="2160"/>
-          </w:tcPr>
-          <w:p>
-            <w:r>
-              <w:t>EMSI-EVENT.ETYPE.CATEGORY</w:t>
-            </w:r>
-          </w:p>
-        </w:tc>
-        <w:tc>
-          <w:tcPr>
-            <w:tcW w:type="dxa" w:w="2160"/>
-          </w:tcPr>
-          <w:p>
-            <w:r>
-              <w:t>EMSI</w:t>
-            </w:r>
-          </w:p>
-        </w:tc>
-      </w:tr>
-      <w:tr>
-        <w:tc>
-          <w:tcPr>
-            <w:tcW w:type="dxa" w:w="2160"/>
-          </w:tcPr>
-          <w:p>
-            <w:r>
-              <w:t>ISO 3166-ISO3166-2</w:t>
-            </w:r>
-          </w:p>
-        </w:tc>
-        <w:tc>
-          <w:tcPr>
-            <w:tcW w:type="dxa" w:w="2160"/>
-          </w:tcPr>
-          <w:p>
-            <w:r>
-              <w:t>ISO3166-2</w:t>
-            </w:r>
-          </w:p>
-        </w:tc>
-        <w:tc>
-          <w:tcPr>
-            <w:tcW w:type="dxa" w:w="2160"/>
-          </w:tcPr>
-          <w:p>
-            <w:r>
-              <w:t>ISO 3166-ISO3166-2</w:t>
-            </w:r>
-          </w:p>
-        </w:tc>
-        <w:tc>
-          <w:tcPr>
-            <w:tcW w:type="dxa" w:w="2160"/>
-          </w:tcPr>
-          <w:p>
-            <w:r>
-              <w:t>ISO 3166</w:t>
             </w:r>
           </w:p>
         </w:tc>
@@ -2424,7 +1668,7 @@
           </w:tcPr>
           <w:p>
             <w:r>
-              <w:t>EMSI-CONTEXT.SECLASS</w:t>
+              <w:t>ISO 3166-ISO3166-2</w:t>
             </w:r>
           </w:p>
         </w:tc>
@@ -2434,7 +1678,7 @@
           </w:tcPr>
           <w:p>
             <w:r>
-              <w:t>CONTEXT.SECLASS</w:t>
+              <w:t>ISO3166-2</w:t>
             </w:r>
           </w:p>
         </w:tc>
@@ -2444,7 +1688,7 @@
           </w:tcPr>
           <w:p>
             <w:r>
-              <w:t>EMSI-CONTEXT.SECLASS</w:t>
+              <w:t>ISO 3166-ISO3166-2</w:t>
             </w:r>
           </w:p>
         </w:tc>
@@ -2454,175 +1698,7 @@
           </w:tcPr>
           <w:p>
             <w:r>
-              <w:t>EMSI</w:t>
-            </w:r>
-          </w:p>
-        </w:tc>
-      </w:tr>
-      <w:tr>
-        <w:tc>
-          <w:tcPr>
-            <w:tcW w:type="dxa" w:w="2160"/>
-          </w:tcPr>
-          <w:p>
-            <w:r>
-              <w:t>EMSI-CONTEXT.LEVEL</w:t>
-            </w:r>
-          </w:p>
-        </w:tc>
-        <w:tc>
-          <w:tcPr>
-            <w:tcW w:type="dxa" w:w="2160"/>
-          </w:tcPr>
-          <w:p>
-            <w:r>
-              <w:t>CONTEXT.LEVEL</w:t>
-            </w:r>
-          </w:p>
-        </w:tc>
-        <w:tc>
-          <w:tcPr>
-            <w:tcW w:type="dxa" w:w="2160"/>
-          </w:tcPr>
-          <w:p>
-            <w:r>
-              <w:t>EMSI-CONTEXT.LEVEL</w:t>
-            </w:r>
-          </w:p>
-        </w:tc>
-        <w:tc>
-          <w:tcPr>
-            <w:tcW w:type="dxa" w:w="2160"/>
-          </w:tcPr>
-          <w:p>
-            <w:r>
-              <w:t>EMSI</w:t>
-            </w:r>
-          </w:p>
-        </w:tc>
-      </w:tr>
-      <w:tr>
-        <w:tc>
-          <w:tcPr>
-            <w:tcW w:type="dxa" w:w="2160"/>
-          </w:tcPr>
-          <w:p>
-            <w:r>
-              <w:t>EMSI-CONTEXT.LINK_ROLE</w:t>
-            </w:r>
-          </w:p>
-        </w:tc>
-        <w:tc>
-          <w:tcPr>
-            <w:tcW w:type="dxa" w:w="2160"/>
-          </w:tcPr>
-          <w:p>
-            <w:r>
-              <w:t>CONTEXT.LINK_ROLE</w:t>
-            </w:r>
-          </w:p>
-        </w:tc>
-        <w:tc>
-          <w:tcPr>
-            <w:tcW w:type="dxa" w:w="2160"/>
-          </w:tcPr>
-          <w:p>
-            <w:r>
-              <w:t>EMSI-CONTEXT.LINK_ROLE</w:t>
-            </w:r>
-          </w:p>
-        </w:tc>
-        <w:tc>
-          <w:tcPr>
-            <w:tcW w:type="dxa" w:w="2160"/>
-          </w:tcPr>
-          <w:p>
-            <w:r>
-              <w:t>EMSI</w:t>
-            </w:r>
-          </w:p>
-        </w:tc>
-      </w:tr>
-      <w:tr>
-        <w:tc>
-          <w:tcPr>
-            <w:tcW w:type="dxa" w:w="2160"/>
-          </w:tcPr>
-          <w:p>
-            <w:r>
-              <w:t>EMSI-CONTEXT.MSGTYPE</w:t>
-            </w:r>
-          </w:p>
-        </w:tc>
-        <w:tc>
-          <w:tcPr>
-            <w:tcW w:type="dxa" w:w="2160"/>
-          </w:tcPr>
-          <w:p>
-            <w:r>
-              <w:t>CONTEXT.MSGTYPE</w:t>
-            </w:r>
-          </w:p>
-        </w:tc>
-        <w:tc>
-          <w:tcPr>
-            <w:tcW w:type="dxa" w:w="2160"/>
-          </w:tcPr>
-          <w:p>
-            <w:r>
-              <w:t>EMSI-CONTEXT.MSGTYPE</w:t>
-            </w:r>
-          </w:p>
-        </w:tc>
-        <w:tc>
-          <w:tcPr>
-            <w:tcW w:type="dxa" w:w="2160"/>
-          </w:tcPr>
-          <w:p>
-            <w:r>
-              <w:t>EMSI</w:t>
-            </w:r>
-          </w:p>
-        </w:tc>
-      </w:tr>
-      <w:tr>
-        <w:tc>
-          <w:tcPr>
-            <w:tcW w:type="dxa" w:w="2160"/>
-          </w:tcPr>
-          <w:p>
-            <w:r>
-              <w:t>EMSI-CONTEXT.MODE</w:t>
-            </w:r>
-          </w:p>
-        </w:tc>
-        <w:tc>
-          <w:tcPr>
-            <w:tcW w:type="dxa" w:w="2160"/>
-          </w:tcPr>
-          <w:p>
-            <w:r>
-              <w:t>CONTEXT.MODE</w:t>
-            </w:r>
-          </w:p>
-        </w:tc>
-        <w:tc>
-          <w:tcPr>
-            <w:tcW w:type="dxa" w:w="2160"/>
-          </w:tcPr>
-          <w:p>
-            <w:r>
-              <w:t>EMSI-CONTEXT.MODE</w:t>
-            </w:r>
-          </w:p>
-        </w:tc>
-        <w:tc>
-          <w:tcPr>
-            <w:tcW w:type="dxa" w:w="2160"/>
-          </w:tcPr>
-          <w:p>
-            <w:r>
-              <w:t>EMSI</w:t>
+              <w:t>ISO 3166</w:t>
             </w:r>
           </w:p>
         </w:tc>

</xml_diff>